<commit_message>
Sync report, slides, and README to the post-audit numbers
Both docs/AutoTender-VN_Report_IEEE.docx and docs/AutoTender-VN_Slides.pptx
still had the retrieval/embedding numbers from before the RAG pipeline
audit (rerank caching, candidate truncation, embedding truncation fixes).
Updated every affected table, chart, and inline figure to the current
reports/retrieval_metrics.json and reports/embedding_comparison.json,
and added a new report subsection (V-B) and slide (12) walking through
the 3 bugs found and their measured before/after impact -- including the
honest mixed result (Recall@5 dipped slightly post-fix on the 46-query
set) rather than only reporting the numbers that improved. README.md's
architecture diagram still said 38 hand-labeled queries; corrected to 46.

Co-Authored-By: Claude Sonnet 5 <noreply@anthropic.com>
</commit_message>
<xml_diff>
--- a/docs/AutoTender-VN_Report_IEEE.docx
+++ b/docs/AutoTender-VN_Report_IEEE.docx
@@ -72,7 +72,7 @@
           <w:sz w:val="20"/>
           <w:szCs w:val="20"/>
         </w:rPr>
-        <w:t xml:space="preserve">Soạn thảo Hồ sơ mời thầu (HSMT) cho gói thầu phần mềm là công việc tốn thời gian, đòi hỏi bám sát nhiều văn bản pháp luật đấu thầu thường xuyên sửa đổi, trong khi việc dùng trực tiếp mô hình ngôn ngữ lớn (LLM) tiềm ẩn rủi ro "ảo giác" — tự sinh ra điều khoản pháp lý không có căn cứ. Bài báo trình bày AutoTender-VN, một hệ thống sinh văn bản có tăng cường truy hồi (Retrieval-Augmented Generation — RAG) chuyên biệt cho miền HSMT phần mềm/công nghệ thông tin (CNTT) tại Việt Nam. Hệ thống dựng kho tri thức pháp luật thật gồm 326 Điều (684 đoạn sau khi chia theo Khoản) trích xuất nguyên văn từ Luật Đấu thầu 22/2023/QH15, Nghị định 214/2025/NĐ-CP, hai Thông tư hướng dẫn và Nghị định 45/2026/NĐ-CP chuyên ngành CNTT; kết hợp truy hồi lai (dense + BM25, hợp nhất bằng Reciprocal Rank Fusion) và xếp hạng lại bằng cross-encoder; sinh từng mục HSMT qua Claude API với trích dẫn căn cứ bắt buộc và bộ kiểm tra số liệu độc lập với mô hình. Trên 46 câu hỏi gán tay, cấu hình truy hồi lai kết hợp rerank đạt Recall@5 = 0.804, MRR = 0.611, nDCG@5 = 0.656 — cải thiện rõ so với BM25 đơn lẻ (Recall@5 = 0.565) và dense đơn lẻ (Recall@5 = 0.696). Ở tầng sinh văn bản, so sánh có/không truy hồi cho thấy RAG nâng độ bám căn cứ pháp lý (faithfulness) từ 0.41 lên 0.94 và độ đầy đủ nội dung (completeness) từ 0.44 lên 0.87, đo bằng LLM-as-judge trên 8 câu hỏi thật. Bài báo cũng trình bày cơ sở học biểu diễn (representation learning) của các thành phần mạng nơ-ron trong hệ thống — kiến trúc bi-encoder/cross-encoder, khảo sát không gian embedding bằng t-SNE/UMAP, và cơ chế sinh tự hồi quy của LLM giải thích vì sao RAG giảm ảo giác — cùng các giới hạn còn tồn tại của hệ thống.</w:t>
+        <w:t xml:space="preserve">Soạn thảo Hồ sơ mời thầu (HSMT) cho gói thầu phần mềm là công việc tốn thời gian, đòi hỏi bám sát nhiều văn bản pháp luật đấu thầu thường xuyên sửa đổi, trong khi việc dùng trực tiếp mô hình ngôn ngữ lớn (LLM) tiềm ẩn rủi ro "ảo giác" — tự sinh ra điều khoản pháp lý không có căn cứ. Bài báo trình bày AutoTender-VN, một hệ thống sinh văn bản có tăng cường truy hồi (Retrieval-Augmented Generation — RAG) chuyên biệt cho miền HSMT phần mềm/công nghệ thông tin (CNTT) tại Việt Nam. Hệ thống dựng kho tri thức pháp luật thật gồm 326 Điều (684 đoạn sau khi chia theo Khoản) trích xuất nguyên văn từ Luật Đấu thầu 22/2023/QH15, Nghị định 214/2025/NĐ-CP, hai Thông tư hướng dẫn và Nghị định 45/2026/NĐ-CP chuyên ngành CNTT; kết hợp truy hồi lai (dense + BM25, hợp nhất bằng Reciprocal Rank Fusion) và xếp hạng lại bằng cross-encoder; sinh từng mục HSMT qua Claude API với trích dẫn căn cứ bắt buộc và bộ kiểm tra số liệu độc lập với mô hình. Trên 46 câu hỏi gán tay, cấu hình truy hồi lai kết hợp rerank đạt Recall@5 = 0.761, MRR = 0.587, nDCG@5 = 0.627 — cải thiện rõ so với BM25 đơn lẻ (Recall@5 = 0.565) và dense đơn lẻ (Recall@5 = 0.696). Ở tầng sinh văn bản, so sánh có/không truy hồi cho thấy RAG nâng độ bám căn cứ pháp lý (faithfulness) từ 0.41 lên 0.94 và độ đầy đủ nội dung (completeness) từ 0.44 lên 0.87, đo bằng LLM-as-judge trên 8 câu hỏi thật. Một đợt rà soát kỹ thuật trực tiếp trên mã nguồn (không chỉ tài liệu) phát hiện và sửa 3 lỗi thật trong pipeline truy hồi — đáng chú ý nhất là 65% đoạn văn bản trong kho tri thức bị cắt âm thầm khi embed do vượt quá giới hạn kiến trúc của mô hình — nâng độ tách biệt không gian embedding 13-15%. Bài báo cũng trình bày cơ sở học biểu diễn (representation learning) của các thành phần mạng nơ-ron trong hệ thống — kiến trúc bi-encoder/cross-encoder, khảo sát không gian embedding bằng t-SNE/UMAP, và cơ chế sinh tự hồi quy của LLM giải thích vì sao RAG giảm ảo giác — cùng các giới hạn còn tồn tại của hệ thống.</w:t>
       </w:r>
     </w:p>
     <w:p>
@@ -454,6 +454,20 @@
           <w:szCs w:val="20"/>
         </w:rPr>
         <w:t xml:space="preserve">Cross-encoder xử lý khác biệt về cấu trúc: cặp (truy vấn, tài liệu) được nối thành MỘT chuỗi input duy nhất, đưa qua transformer, để self-attention có thể so khớp trực tiếp từng token của truy vấn với từng token của tài liệu ngay trong quá trình mã hoá, thay vì chỉ so hai vector đã nén sẵn. Điều này cho độ chính xác cao hơn bi-encoder vì không mất thông tin tương tác chi tiết, nhưng không tính trước được — phải chạy lại cho mọi cặp ứng viên tại thời điểm truy vấn, giải thích vì sao hệ thống chỉ dùng cross-encoder để xếp hạng lại một tập nhỏ (top-50) đã được bi-encoder/BM25 lọc thô trước, thay vì quét toàn bộ kho tri thức.</w:t>
+      </w:r>
+    </w:p>
+    <w:p>
+      <w:pPr>
+        <w:spacing w:after="120"/>
+        <w:jc w:val="both"/>
+      </w:pPr>
+      <w:r>
+        <w:rPr>
+          <w:rFonts w:ascii="Times New Roman" w:cs="Times New Roman" w:eastAsia="Times New Roman" w:hAnsi="Times New Roman"/>
+          <w:sz w:val="20"/>
+          <w:szCs w:val="20"/>
+        </w:rPr>
+        <w:t xml:space="preserve">Một hệ quả kiến trúc quan trọng: `vietnamese-bi-encoder` (nền RoBERTa/PhoBERT) có `max_position_embeddings=258` — giới hạn CỨNG do số vị trí embedding đã huấn luyện, không thể tăng qua tham số cấu hình (khác `multilingual_minilm`, nền BERT hỗ trợ kiến trúc tới 512 vị trí dù checkpoint công khai chỉ cấu hình dùng 128). Đo trực tiếp trên kho tri thức: 65% đoạn (447/684) dài hơn 256 token, trung bình 310, tối đa 568 — vượt xa ngân sách của bi-encoder. Hàm mã hoá mặc định của thư viện `sentence-transformers` CẮT ÂM THẦM phần vượt quá, không báo lỗi rõ ràng — chi tiết và cách khắc phục ở Mục V-B.</w:t>
       </w:r>
     </w:p>
     <w:p>
@@ -574,7 +588,7 @@
           <w:sz w:val="20"/>
           <w:szCs w:val="20"/>
         </w:rPr>
-        <w:t xml:space="preserve">Hai mô hình được so sánh: vi_bi_encoder (bkai-foundation-models/vietnamese-bi-encoder, fine-tune SimCSE trên PhoBERT/XLM-R với dữ liệu tiếng Việt, 768 chiều) và multilingual_minilm (sentence-transformers/paraphrase-multilingual-MiniLM-L12-v2, đa ngôn ngữ, 384 chiều). Để đo định lượng chất lượng phân biệt của mỗi không gian embedding mà không cần tập câu hỏi gán nhãn, nhóm định nghĩa "độ tách biệt" = cosine similarity trung bình giữa các đoạn CÙNG một Điều (intra) trừ similarity trung bình giữa các đoạn KHÁC Điều (inter). Bảng I cho thấy dù model đa ngôn ngữ có similarity tuyệt đối cao hơn ở cả hai nhóm (dấu hiệu embedding "co cụm" hơn, kém phân biệt hơn theo nghĩa tuyệt đối), model tiếng Việt chuyên biệt có độ tách biệt tương đối cao hơn (0.1595 so với 0.1477) — phân biệt tốt hơn giữa các chủ đề pháp lý khác nhau. Kết quả này khớp với bảng Recall@k đo trực tiếp qua truy vấn thật (Mục V-A, vi_bi_encoder đạt Recall@5 = 0.696 ở chế độ dense-only) — hai phép đo độc lập, một dựa trên cấu trúc không gian embedding, một dựa trên truy vấn thật, đều ủng hộ cùng kết luận.</w:t>
+        <w:t xml:space="preserve">Hai mô hình được so sánh: vi_bi_encoder (bkai-foundation-models/vietnamese-bi-encoder, fine-tune SimCSE trên PhoBERT/XLM-R với dữ liệu tiếng Việt, 768 chiều) và multilingual_minilm (sentence-transformers/paraphrase-multilingual-MiniLM-L12-v2, đa ngôn ngữ, 384 chiều). Để đo định lượng chất lượng phân biệt của mỗi không gian embedding mà không cần tập câu hỏi gán nhãn, nhóm định nghĩa "độ tách biệt" = cosine similarity trung bình giữa các đoạn CÙNG một Điều (intra) trừ similarity trung bình giữa các đoạn KHÁC Điều (inter). Số liệu Bảng I đo SAU khi sửa lỗi mã hoá văn bản dài ở Mục V-B — trước đó độ tách biệt chỉ đạt 0.1595 (vi_bi_encoder) và 0.1477 (multilingual_minilm), tăng lần lượt +15% và +13% sau khi embedding phản ánh đúng toàn bộ nội dung đoạn thay vì chỉ phần đầu bị cắt. Bảng I cho thấy dù model đa ngôn ngữ có similarity tuyệt đối cao hơn ở cả hai nhóm (dấu hiệu embedding "co cụm" hơn, kém phân biệt hơn theo nghĩa tuyệt đối), model tiếng Việt chuyên biệt có độ tách biệt tương đối cao hơn (0.1836 so với 0.1674) — phân biệt tốt hơn giữa các chủ đề pháp lý khác nhau. Kết quả này khớp với bảng Recall@k đo trực tiếp qua truy vấn thật (Mục V-A, vi_bi_encoder đạt Recall@5 = 0.696 ở chế độ dense-only) — hai phép đo độc lập, một dựa trên cấu trúc không gian embedding, một dựa trên truy vấn thật, đều ủng hộ cùng kết luận.</w:t>
       </w:r>
     </w:p>
     <w:tbl>
@@ -760,7 +774,7 @@
                 <w:sz w:val="16"/>
                 <w:szCs w:val="16"/>
               </w:rPr>
-              <w:t xml:space="preserve">0.4838</w:t>
+              <w:t xml:space="preserve">0.5320</w:t>
             </w:r>
           </w:p>
         </w:tc>
@@ -787,7 +801,7 @@
                 <w:sz w:val="16"/>
                 <w:szCs w:val="16"/>
               </w:rPr>
-              <w:t xml:space="preserve">0.3244</w:t>
+              <w:t xml:space="preserve">0.3483</w:t>
             </w:r>
           </w:p>
         </w:tc>
@@ -814,7 +828,7 @@
                 <w:sz w:val="16"/>
                 <w:szCs w:val="16"/>
               </w:rPr>
-              <w:t xml:space="preserve">0.1595</w:t>
+              <w:t xml:space="preserve">0.1836</w:t>
             </w:r>
           </w:p>
         </w:tc>
@@ -870,7 +884,7 @@
                 <w:sz w:val="16"/>
                 <w:szCs w:val="16"/>
               </w:rPr>
-              <w:t xml:space="preserve">0.6585</w:t>
+              <w:t xml:space="preserve">0.7480</w:t>
             </w:r>
           </w:p>
         </w:tc>
@@ -897,7 +911,7 @@
                 <w:sz w:val="16"/>
                 <w:szCs w:val="16"/>
               </w:rPr>
-              <w:t xml:space="preserve">0.5109</w:t>
+              <w:t xml:space="preserve">0.5806</w:t>
             </w:r>
           </w:p>
         </w:tc>
@@ -924,7 +938,7 @@
                 <w:sz w:val="16"/>
                 <w:szCs w:val="16"/>
               </w:rPr>
-              <w:t xml:space="preserve">0.1477</w:t>
+              <w:t xml:space="preserve">0.1674</w:t>
             </w:r>
           </w:p>
         </w:tc>
@@ -1017,7 +1031,7 @@
           <w:sz w:val="20"/>
           <w:szCs w:val="20"/>
         </w:rPr>
-        <w:t xml:space="preserve">RAG khai thác khả năng in-context learning của transformer: khi các đoạn trích dẫn thật được chèn trực tiếp vào chuỗi input (prompt) trước khi mô hình sinh câu trả lời, cơ chế self-attention cho phép mô hình "chú ý" đến các đoạn này ở MỌI bước sinh tiếp theo — hiệu quả tương đương một dạng suy luận few-shot dựa trên ngữ cảnh, không cần cập nhật trọng số. Vì token dự đoán ở mỗi bước bị ràng buộc bởi toàn bộ ngữ cảnh (bao gồm cả đoạn trích dẫn), việc cung cấp đúng ngữ cảnh làm giảm xác suất mô hình "trôi" về tri thức nội tại không chính xác — đây là cơ chế thần kinh (không chỉ là quy ước prompt) giải thích tại sao RAG giảm ảo giác so với gọi LLM trần. Kết quả thực nghiệm ở Mục V-B (faithfulness 0.41 → 0.94) là bằng chứng định lượng trực tiếp cho lập luận lý thuyết này.</w:t>
+        <w:t xml:space="preserve">RAG khai thác khả năng in-context learning của transformer: khi các đoạn trích dẫn thật được chèn trực tiếp vào chuỗi input (prompt) trước khi mô hình sinh câu trả lời, cơ chế self-attention cho phép mô hình "chú ý" đến các đoạn này ở MỌI bước sinh tiếp theo — hiệu quả tương đương một dạng suy luận few-shot dựa trên ngữ cảnh, không cần cập nhật trọng số. Vì token dự đoán ở mỗi bước bị ràng buộc bởi toàn bộ ngữ cảnh (bao gồm cả đoạn trích dẫn), việc cung cấp đúng ngữ cảnh làm giảm xác suất mô hình "trôi" về tri thức nội tại không chính xác — đây là cơ chế thần kinh (không chỉ là quy ước prompt) giải thích tại sao RAG giảm ảo giác so với gọi LLM trần. Kết quả thực nghiệm ở Mục V-C (faithfulness 0.41 → 0.94) là bằng chứng định lượng trực tiếp cho lập luận lý thuyết này.</w:t>
       </w:r>
     </w:p>
     <w:p>
@@ -1064,7 +1078,7 @@
           <w:sz w:val="20"/>
           <w:szCs w:val="20"/>
         </w:rPr>
-        <w:t xml:space="preserve">Trên 46 câu hỏi gán tay (mỗi câu gán nhãn Điều đúng cần truy xuất, bao gồm 8 câu nhắm riêng vào nội dung Nghị định 45/2026/NĐ-CP để đảm bảo phần mở rộng kho tri thức thật sự được đánh giá), Bảng II so sánh 4 chế độ truy hồi. BM25 đơn lẻ yếu nhất — không hiểu ngữ nghĩa, chỉ khớp từ khoá; dense đơn lẻ cải thiện rõ rệt; kết hợp hybrid RRF không vượt dense-only trên tập câu hỏi này (BM25 đôi khi đẩy kết quả đúng ra xa vị trí đầu dù vẫn giữ trong top-5, kéo MRR/nDCG@5 xuống); rerank bằng cross-encoder cải thiện mạnh nhất trên mọi chỉ số, đúng với phân tích ở Mục IV-D, nhưng có chi phí thời gian rất cao (~19.7 giây/câu so với ~0.3 giây/câu của hybrid không rerank) — một đánh đổi thực tế cần cân nhắc giữa Mức 1 (tương tác thời gian thực) và Mức 2 (chấp nhận độ trễ cao hơn).</w:t>
+        <w:t xml:space="preserve">Trên 46 câu hỏi gán tay (mỗi câu gán nhãn Điều đúng cần truy xuất, bao gồm 8 câu nhắm riêng vào nội dung Nghị định 45/2026/NĐ-CP để đảm bảo phần mở rộng kho tri thức thật sự được đánh giá), Bảng II so sánh 4 chế độ truy hồi. BM25 đơn lẻ yếu nhất — không hiểu ngữ nghĩa, chỉ khớp từ khoá; dense đơn lẻ cải thiện rõ rệt; kết hợp hybrid RRF không vượt dense-only trên tập câu hỏi này (BM25 đôi khi đẩy kết quả đúng ra xa vị trí đầu dù vẫn giữ trong top-5, kéo MRR/nDCG@5 xuống); rerank bằng cross-encoder vẫn cải thiện nhiều nhất trên mọi chỉ số, đúng với phân tích ở Mục IV-D, với chi phí thời gian ~7.6 giây/câu (sau 2 fix hiệu năng ở Mục V-B, giảm từ ~19.7 giây/câu ban đầu) so với ~0.3 giây/câu của hybrid không rerank — một đánh đổi thực tế cần cân nhắc giữa Mức 1 (tương tác thời gian thực) và Mức 2 (chấp nhận độ trễ cao hơn).</w:t>
       </w:r>
     </w:p>
     <w:tbl>
@@ -1387,7 +1401,7 @@
                 <w:sz w:val="16"/>
                 <w:szCs w:val="16"/>
               </w:rPr>
-              <w:t xml:space="preserve">0.543</w:t>
+              <w:t xml:space="preserve">0.546</w:t>
             </w:r>
           </w:p>
         </w:tc>
@@ -1414,7 +1428,7 @@
                 <w:sz w:val="16"/>
                 <w:szCs w:val="16"/>
               </w:rPr>
-              <w:t xml:space="preserve">0.575</w:t>
+              <w:t xml:space="preserve">0.580</w:t>
             </w:r>
           </w:p>
         </w:tc>
@@ -1497,7 +1511,7 @@
                 <w:sz w:val="16"/>
                 <w:szCs w:val="16"/>
               </w:rPr>
-              <w:t xml:space="preserve">0.507</w:t>
+              <w:t xml:space="preserve">0.537</w:t>
             </w:r>
           </w:p>
         </w:tc>
@@ -1524,7 +1538,7 @@
                 <w:sz w:val="16"/>
                 <w:szCs w:val="16"/>
               </w:rPr>
-              <w:t xml:space="preserve">0.541</w:t>
+              <w:t xml:space="preserve">0.564</w:t>
             </w:r>
           </w:p>
         </w:tc>
@@ -1582,7 +1596,7 @@
                 <w:sz w:val="16"/>
                 <w:szCs w:val="16"/>
               </w:rPr>
-              <w:t xml:space="preserve">0.804</w:t>
+              <w:t xml:space="preserve">0.761</w:t>
             </w:r>
           </w:p>
         </w:tc>
@@ -1610,7 +1624,7 @@
                 <w:sz w:val="16"/>
                 <w:szCs w:val="16"/>
               </w:rPr>
-              <w:t xml:space="preserve">0.611</w:t>
+              <w:t xml:space="preserve">0.587</w:t>
             </w:r>
           </w:p>
         </w:tc>
@@ -1638,7 +1652,7 @@
                 <w:sz w:val="16"/>
                 <w:szCs w:val="16"/>
               </w:rPr>
-              <w:t xml:space="preserve">0.656</w:t>
+              <w:t xml:space="preserve">0.627</w:t>
             </w:r>
           </w:p>
         </w:tc>
@@ -1655,7 +1669,7 @@
           <w:sz w:val="16"/>
           <w:szCs w:val="16"/>
         </w:rPr>
-        <w:t xml:space="preserve">BẢNG II. KẾT QUẢ TRUY HỒI TRÊN 46 CÂU HỎI GÁN TAY</w:t>
+        <w:t xml:space="preserve">BẢNG II. KẾT QUẢ TRUY HỒI TRÊN 46 CÂU HỎI GÁN TAY (SAU 3 FIX Ở MỤC V-B)</w:t>
       </w:r>
     </w:p>
     <w:p>
@@ -1672,7 +1686,94 @@
           <w:sz w:val="20"/>
           <w:szCs w:val="20"/>
         </w:rPr>
-        <w:t xml:space="preserve">B. Đánh giá sinh văn bản: RAG so với LLM trần</w:t>
+        <w:t xml:space="preserve">B. Ba lỗi kỹ thuật phát hiện qua rà soát pipeline</w:t>
+      </w:r>
+    </w:p>
+    <w:p>
+      <w:pPr>
+        <w:spacing w:after="120"/>
+        <w:jc w:val="both"/>
+      </w:pPr>
+      <w:r>
+        <w:rPr>
+          <w:rFonts w:ascii="Times New Roman" w:cs="Times New Roman" w:eastAsia="Times New Roman" w:hAnsi="Times New Roman"/>
+          <w:sz w:val="20"/>
+          <w:szCs w:val="20"/>
+        </w:rPr>
+        <w:t xml:space="preserve">Rà soát trực tiếp mã nguồn (không chỉ tài liệu thiết kế) theo 6 hạng mục — kiến trúc RAG, xử lý embedding, mã hoá/giải mã vector, sử dụng LLM transformer, chiến lược chunking, nhánh indexing — phát hiện 3 lỗi thật, đo tác động trước/sau thay vì chỉ sửa theo suy đoán:</w:t>
+      </w:r>
+    </w:p>
+    <w:p>
+      <w:pPr>
+        <w:spacing w:after="60"/>
+        <w:ind w:left="260" w:hanging="200"/>
+      </w:pPr>
+      <w:r>
+        <w:rPr>
+          <w:rFonts w:ascii="Times New Roman" w:cs="Times New Roman" w:eastAsia="Times New Roman" w:hAnsi="Times New Roman"/>
+          <w:sz w:val="20"/>
+          <w:szCs w:val="20"/>
+        </w:rPr>
+        <w:t xml:space="preserve">• Cross-encoder rerank bị khởi tạo lại từ đầu ở MỖI lượt gọi thay vì cache theo tên model — đo thực tế: tải model tốn ~6-7 giây, trong khi inference thật trên văn bản luật dài chỉ ~0.2-0.4 giây. Thêm cache module-level (cùng nguyên tắc lazy-cache đã dùng cho bi-encoder) giảm 57% tổng thời gian rerank trên 46 câu (908s→391s).</w:t>
+      </w:r>
+    </w:p>
+    <w:p>
+      <w:pPr>
+        <w:spacing w:after="60"/>
+        <w:ind w:left="260" w:hanging="200"/>
+      </w:pPr>
+      <w:r>
+        <w:rPr>
+          <w:rFonts w:ascii="Times New Roman" w:cs="Times New Roman" w:eastAsia="Times New Roman" w:hAnsi="Times New Roman"/>
+          <w:sz w:val="20"/>
+          <w:szCs w:val="20"/>
+        </w:rPr>
+        <w:t xml:space="preserve">• Bước hợp nhất RRF (dense+sparse) trả về TẬP HỢP có thể vượt quá số ứng viên khai báo trước khi rerank — đo thực tế: 82 ứng viên thay vì 50 trên corpus 684 đoạn (tăng 64% khối lượng tính không cần thiết). Cắt đúng về `candidate_k` trước khi đưa vào cross-encoder.</w:t>
+      </w:r>
+    </w:p>
+    <w:p>
+      <w:pPr>
+        <w:spacing w:after="60"/>
+        <w:ind w:left="260" w:hanging="200"/>
+      </w:pPr>
+      <w:r>
+        <w:rPr>
+          <w:rFonts w:ascii="Times New Roman" w:cs="Times New Roman" w:eastAsia="Times New Roman" w:hAnsi="Times New Roman"/>
+          <w:sz w:val="20"/>
+          <w:szCs w:val="20"/>
+        </w:rPr>
+        <w:t xml:space="preserve">• Lỗi quan trọng nhất (Mục IV-A): 65% đoạn kho tri thức (447/684) bị `SentenceTransformer.encode()` CẮT ÂM THẦM khi vượt quá `max_seq_length` — không có cảnh báo rõ ràng cho người phát triển. Viết hàm `encode_texts` xử lý bằng sliding-window mean-pooling dựa trên tokenizer thật của từng model, áp dụng nhất quán ở cả lúc dựng index lẫn lúc mã hoá câu truy vấn.</w:t>
+      </w:r>
+    </w:p>
+    <w:p>
+      <w:pPr>
+        <w:spacing w:after="120"/>
+        <w:jc w:val="both"/>
+      </w:pPr>
+      <w:r>
+        <w:rPr>
+          <w:rFonts w:ascii="Times New Roman" w:cs="Times New Roman" w:eastAsia="Times New Roman" w:hAnsi="Times New Roman"/>
+          <w:sz w:val="20"/>
+          <w:szCs w:val="20"/>
+        </w:rPr>
+        <w:t xml:space="preserve">Kết quả sau khi áp dụng cả 3 fix: độ tách biệt không gian embedding tăng 13-15% (Bảng I, bằng chứng độc lập không phụ thuộc tập câu hỏi), dense/hybrid-only cải thiện nhẹ MRR/nDCG@5, nhưng chỉ số SAU rerank trên tập 46 câu lại giảm nhẹ so với trước (Recall@5 0.804→0.761) — nhiều khả năng do embedding chính xác hơn làm thay đổi thành phần tập ứng viên top-50 đưa vào cross-encoder theo cách không đơn điệu, với cỡ mẫu 46 câu chưa đủ để phân biệt xu hướng thật với nhiễu thống kê. Quyết định giữ nguyên fix: cắt âm thầm dữ liệu là lỗi đúng-sai rõ ràng, không phải một lựa chọn thiết kế có thể đánh đổi lấy điểm số cao hơn trên một tập đánh giá nhỏ.</w:t>
+      </w:r>
+    </w:p>
+    <w:p>
+      <w:pPr>
+        <w:spacing w:after="80" w:before="160"/>
+      </w:pPr>
+      <w:r>
+        <w:rPr>
+          <w:rFonts w:ascii="Times New Roman" w:cs="Times New Roman" w:eastAsia="Times New Roman" w:hAnsi="Times New Roman"/>
+          <w:b/>
+          <w:bCs/>
+          <w:i/>
+          <w:iCs/>
+          <w:sz w:val="20"/>
+          <w:szCs w:val="20"/>
+        </w:rPr>
+        <w:t xml:space="preserve">C. Đánh giá sinh văn bản: RAG so với LLM trần</w:t>
       </w:r>
     </w:p>
     <w:p>
@@ -2059,7 +2160,21 @@
           <w:sz w:val="20"/>
           <w:szCs w:val="20"/>
         </w:rPr>
-        <w:t xml:space="preserve">• Rerank bằng cross-encoder cải thiện chất lượng truy hồi rõ rệt nhưng chi phí độ trễ cao (~20 giây/câu), cần cân nhắc kỹ khi triển khai cho luồng tương tác thời gian thực.</w:t>
+        <w:t xml:space="preserve">• Rerank bằng cross-encoder cải thiện chất lượng truy hồi rõ rệt nhưng vẫn còn độ trễ đáng kể (~7.6 giây/câu sau khi sửa lỗi tải lại model, giảm từ ~20 giây/câu ban đầu), cần cân nhắc kỹ khi triển khai cho luồng tương tác thời gian thực.</w:t>
+      </w:r>
+    </w:p>
+    <w:p>
+      <w:pPr>
+        <w:spacing w:after="60"/>
+        <w:ind w:left="260" w:hanging="200"/>
+      </w:pPr>
+      <w:r>
+        <w:rPr>
+          <w:rFonts w:ascii="Times New Roman" w:cs="Times New Roman" w:eastAsia="Times New Roman" w:hAnsi="Times New Roman"/>
+          <w:sz w:val="20"/>
+          <w:szCs w:val="20"/>
+        </w:rPr>
+        <w:t xml:space="preserve">• Kết quả Recall@5 sau rerank giảm nhẹ sau khi sửa lỗi mã hoá văn bản dài (Mục V-B) — cỡ mẫu 46 câu hỏi chưa đủ lớn để phân biệt đây là xu hướng thật (tương tác giữa embedding chính xác hơn và thành phần tập ứng viên đưa vào cross-encoder) hay nhiễu thống kê; cần tập câu hỏi lớn hơn để đánh giá lại một cách đáng tin cậy.</w:t>
       </w:r>
     </w:p>
     <w:p>
@@ -2089,7 +2204,7 @@
           <w:sz w:val="20"/>
           <w:szCs w:val="20"/>
         </w:rPr>
-        <w:t xml:space="preserve">Bài báo trình bày AutoTender-VN, một hệ thống RAG chuyên biệt cho việc soạn thảo HSMT gói thầu phần mềm/CNTT tại Việt Nam, dựng trên kho tri thức pháp luật thật 326 Điều — bao gồm cả một văn bản chuyên ngành CNTT được khôi phục thành công từ nguồn thay thế sau khi nguồn chính thức chỉ có bản scan ảnh. Thực nghiệm định lượng trên cả hai tầng (truy hồi và sinh văn bản) xác nhận giá trị của kiến trúc RAG: truy hồi lai kết hợp rerank vượt trội mọi phương án đơn lẻ (Recall@5 = 0.804), và việc cấp ngữ cảnh trích dẫn thật nâng độ bám căn cứ pháp lý của văn bản sinh ra từ 0.41 lên 0.94. Các kết quả này, cùng phân tích kiến trúc biểu diễn và cơ chế sinh tự hồi quy trình bày ở Mục IV, cho thấy đóng góp chính của đề tài nằm ở việc thiết kế, ghép nối và đánh giá nghiêm túc các thành phần mạng nơ-ron pretrained cho một miền ứng dụng cụ thể — đúng định hướng "RAG + LLM" mà đề cương môn học đặt ra, thay vì tự huấn luyện mô hình từ đầu.</w:t>
+        <w:t xml:space="preserve">Bài báo trình bày AutoTender-VN, một hệ thống RAG chuyên biệt cho việc soạn thảo HSMT gói thầu phần mềm/CNTT tại Việt Nam, dựng trên kho tri thức pháp luật thật 326 Điều — bao gồm cả một văn bản chuyên ngành CNTT được khôi phục thành công từ nguồn thay thế sau khi nguồn chính thức chỉ có bản scan ảnh. Thực nghiệm định lượng trên cả hai tầng (truy hồi và sinh văn bản) xác nhận giá trị của kiến trúc RAG: truy hồi lai kết hợp rerank vượt trội mọi phương án đơn lẻ (Recall@5 = 0.761), và việc cấp ngữ cảnh trích dẫn thật nâng độ bám căn cứ pháp lý của văn bản sinh ra từ 0.41 lên 0.94. Một đợt rà soát kỹ thuật độc lập trên chính mã nguồn pipeline (Mục V-B) phát hiện và sửa 3 lỗi thật — đáng chú ý nhất là lỗi cắt âm thầm 65% nội dung kho tri thức khi mã hoá — minh hoạ giá trị của việc kiểm chứng bằng đo đạc thực tế thay vì chỉ tin vào thiết kế trên giấy. Các kết quả này, cùng phân tích kiến trúc biểu diễn và cơ chế sinh tự hồi quy trình bày ở Mục IV, cho thấy đóng góp chính của đề tài nằm ở việc thiết kế, ghép nối và đánh giá nghiêm túc các thành phần mạng nơ-ron pretrained cho một miền ứng dụng cụ thể — đúng định hướng "RAG + LLM" mà đề cương môn học đặt ra, thay vì tự huấn luyện mô hình từ đầu.</w:t>
       </w:r>
     </w:p>
     <w:p>

</xml_diff>